<commit_message>
csv ready to be inserted to the sql
</commit_message>
<xml_diff>
--- a/Relational schema.docx
+++ b/Relational schema.docx
@@ -27,15 +27,19 @@
       <w:pPr>
         <w:spacing w:after="0"/>
       </w:pPr>
+      <w:proofErr w:type="gramStart"/>
       <w:r>
         <w:t>user(</w:t>
       </w:r>
+      <w:proofErr w:type="spellStart"/>
+      <w:proofErr w:type="gramEnd"/>
       <w:r>
         <w:rPr>
           <w:u w:val="single"/>
         </w:rPr>
         <w:t>user_id</w:t>
       </w:r>
+      <w:proofErr w:type="spellEnd"/>
       <w:r>
         <w:t>, location, age)</w:t>
       </w:r>
@@ -44,17 +48,53 @@
       <w:pPr>
         <w:spacing w:after="0"/>
       </w:pPr>
-      <w:r>
-        <w:t>tourism_with_id(</w:t>
-      </w:r>
+      <w:proofErr w:type="spellStart"/>
+      <w:r>
+        <w:t>tourism_with_</w:t>
+      </w:r>
+      <w:proofErr w:type="gramStart"/>
+      <w:r>
+        <w:t>id</w:t>
+      </w:r>
+      <w:proofErr w:type="spellEnd"/>
+      <w:r>
+        <w:t>(</w:t>
+      </w:r>
+      <w:proofErr w:type="spellStart"/>
+      <w:proofErr w:type="gramEnd"/>
       <w:r>
         <w:rPr>
           <w:u w:val="single"/>
         </w:rPr>
         <w:t>place_id</w:t>
       </w:r>
-      <w:r>
-        <w:t>, place_name, description, category, city, price, rating, time_minutes, lat, long)</w:t>
+      <w:proofErr w:type="spellEnd"/>
+      <w:r>
+        <w:t xml:space="preserve">, </w:t>
+      </w:r>
+      <w:proofErr w:type="spellStart"/>
+      <w:r>
+        <w:t>place_name</w:t>
+      </w:r>
+      <w:proofErr w:type="spellEnd"/>
+      <w:r>
+        <w:t xml:space="preserve">, description, category, city, price, rating, </w:t>
+      </w:r>
+      <w:proofErr w:type="spellStart"/>
+      <w:r>
+        <w:t>time_minutes</w:t>
+      </w:r>
+      <w:proofErr w:type="spellEnd"/>
+      <w:r>
+        <w:t xml:space="preserve">, </w:t>
+      </w:r>
+      <w:proofErr w:type="spellStart"/>
+      <w:r>
+        <w:t>lat</w:t>
+      </w:r>
+      <w:proofErr w:type="spellEnd"/>
+      <w:r>
+        <w:t>, long)</w:t>
       </w:r>
     </w:p>
     <w:p>
@@ -70,9 +110,19 @@
       <w:pPr>
         <w:spacing w:after="0"/>
       </w:pPr>
-      <w:r>
-        <w:t>package_tourism(</w:t>
-      </w:r>
+      <w:proofErr w:type="spellStart"/>
+      <w:r>
+        <w:t>package_</w:t>
+      </w:r>
+      <w:proofErr w:type="gramStart"/>
+      <w:r>
+        <w:t>tourism</w:t>
+      </w:r>
+      <w:proofErr w:type="spellEnd"/>
+      <w:r>
+        <w:t>(</w:t>
+      </w:r>
+      <w:proofErr w:type="gramEnd"/>
       <w:r>
         <w:rPr>
           <w:u w:val="single"/>
@@ -89,7 +139,23 @@
       </w:pPr>
       <w:r>
         <w:tab/>
-        <w:t>FK place_tourism1 REF tourism_with_id(place_name)</w:t>
+        <w:t xml:space="preserve">FK place_tourism1 REF </w:t>
+      </w:r>
+      <w:proofErr w:type="spellStart"/>
+      <w:r>
+        <w:t>tourism_with_id</w:t>
+      </w:r>
+      <w:proofErr w:type="spellEnd"/>
+      <w:r>
+        <w:t>(</w:t>
+      </w:r>
+      <w:proofErr w:type="spellStart"/>
+      <w:r>
+        <w:t>place_name</w:t>
+      </w:r>
+      <w:proofErr w:type="spellEnd"/>
+      <w:r>
+        <w:t>)</w:t>
       </w:r>
     </w:p>
     <w:p>
@@ -98,7 +164,23 @@
       </w:pPr>
       <w:r>
         <w:tab/>
-        <w:t>FK place_tourism2 REF tourism_with_id(place_name)</w:t>
+        <w:t xml:space="preserve">FK place_tourism2 REF </w:t>
+      </w:r>
+      <w:proofErr w:type="spellStart"/>
+      <w:r>
+        <w:t>tourism_with_id</w:t>
+      </w:r>
+      <w:proofErr w:type="spellEnd"/>
+      <w:r>
+        <w:t>(</w:t>
+      </w:r>
+      <w:proofErr w:type="spellStart"/>
+      <w:r>
+        <w:t>place_name</w:t>
+      </w:r>
+      <w:proofErr w:type="spellEnd"/>
+      <w:r>
+        <w:t>)</w:t>
       </w:r>
     </w:p>
     <w:p>
@@ -107,7 +189,23 @@
       </w:pPr>
       <w:r>
         <w:tab/>
-        <w:t>FK place_tourism3 REF tourism_with_id(place_name)</w:t>
+        <w:t xml:space="preserve">FK place_tourism3 REF </w:t>
+      </w:r>
+      <w:proofErr w:type="spellStart"/>
+      <w:r>
+        <w:t>tourism_with_id</w:t>
+      </w:r>
+      <w:proofErr w:type="spellEnd"/>
+      <w:r>
+        <w:t>(</w:t>
+      </w:r>
+      <w:proofErr w:type="spellStart"/>
+      <w:r>
+        <w:t>place_name</w:t>
+      </w:r>
+      <w:proofErr w:type="spellEnd"/>
+      <w:r>
+        <w:t>)</w:t>
       </w:r>
     </w:p>
     <w:p>
@@ -116,7 +214,23 @@
       </w:pPr>
       <w:r>
         <w:tab/>
-        <w:t>FK place_tourism4 REF tourism_with_id(place_name)</w:t>
+        <w:t xml:space="preserve">FK place_tourism4 REF </w:t>
+      </w:r>
+      <w:proofErr w:type="spellStart"/>
+      <w:r>
+        <w:t>tourism_with_id</w:t>
+      </w:r>
+      <w:proofErr w:type="spellEnd"/>
+      <w:r>
+        <w:t>(</w:t>
+      </w:r>
+      <w:proofErr w:type="spellStart"/>
+      <w:r>
+        <w:t>place_name</w:t>
+      </w:r>
+      <w:proofErr w:type="spellEnd"/>
+      <w:r>
+        <w:t>)</w:t>
       </w:r>
     </w:p>
     <w:p>
@@ -125,7 +239,23 @@
       </w:pPr>
       <w:r>
         <w:tab/>
-        <w:t>FK place_tourism5 REF tourism_with_id(place_name)</w:t>
+        <w:t xml:space="preserve">FK place_tourism5 REF </w:t>
+      </w:r>
+      <w:proofErr w:type="spellStart"/>
+      <w:r>
+        <w:t>tourism_with_id</w:t>
+      </w:r>
+      <w:proofErr w:type="spellEnd"/>
+      <w:r>
+        <w:t>(</w:t>
+      </w:r>
+      <w:proofErr w:type="spellStart"/>
+      <w:r>
+        <w:t>place_name</w:t>
+      </w:r>
+      <w:proofErr w:type="spellEnd"/>
+      <w:r>
+        <w:t>)</w:t>
       </w:r>
     </w:p>
     <w:p>
@@ -146,26 +276,48 @@
       <w:pPr>
         <w:spacing w:after="0"/>
       </w:pPr>
-      <w:r>
-        <w:t>Tourism_rating(</w:t>
-      </w:r>
+      <w:proofErr w:type="spellStart"/>
+      <w:r>
+        <w:t>Tourism_</w:t>
+      </w:r>
+      <w:proofErr w:type="gramStart"/>
+      <w:r>
+        <w:t>rating</w:t>
+      </w:r>
+      <w:proofErr w:type="spellEnd"/>
+      <w:r>
+        <w:t>(</w:t>
+      </w:r>
+      <w:proofErr w:type="spellStart"/>
+      <w:proofErr w:type="gramEnd"/>
       <w:r>
         <w:rPr>
           <w:u w:val="single"/>
         </w:rPr>
         <w:t>user_id</w:t>
       </w:r>
+      <w:proofErr w:type="spellEnd"/>
       <w:r>
         <w:t xml:space="preserve">, </w:t>
       </w:r>
+      <w:proofErr w:type="spellStart"/>
       <w:r>
         <w:rPr>
           <w:u w:val="single"/>
         </w:rPr>
         <w:t>place_id</w:t>
       </w:r>
-      <w:r>
-        <w:t>, place_ratings)</w:t>
+      <w:proofErr w:type="spellEnd"/>
+      <w:r>
+        <w:t xml:space="preserve">, </w:t>
+      </w:r>
+      <w:proofErr w:type="spellStart"/>
+      <w:r>
+        <w:t>place_ratings</w:t>
+      </w:r>
+      <w:proofErr w:type="spellEnd"/>
+      <w:r>
+        <w:t>)</w:t>
       </w:r>
     </w:p>
     <w:p>
@@ -174,7 +326,23 @@
       </w:pPr>
       <w:r>
         <w:tab/>
-        <w:t>FK user_id REF user(user_id)</w:t>
+        <w:t xml:space="preserve">FK </w:t>
+      </w:r>
+      <w:proofErr w:type="spellStart"/>
+      <w:r>
+        <w:t>user_id</w:t>
+      </w:r>
+      <w:proofErr w:type="spellEnd"/>
+      <w:r>
+        <w:t xml:space="preserve"> REF user(</w:t>
+      </w:r>
+      <w:proofErr w:type="spellStart"/>
+      <w:r>
+        <w:t>user_id</w:t>
+      </w:r>
+      <w:proofErr w:type="spellEnd"/>
+      <w:r>
+        <w:t>)</w:t>
       </w:r>
     </w:p>
     <w:p>
@@ -183,7 +351,31 @@
       </w:pPr>
       <w:r>
         <w:tab/>
-        <w:t>FK place_id REF tourism_with_id(place_id)</w:t>
+        <w:t xml:space="preserve">FK </w:t>
+      </w:r>
+      <w:proofErr w:type="spellStart"/>
+      <w:r>
+        <w:t>place_id</w:t>
+      </w:r>
+      <w:proofErr w:type="spellEnd"/>
+      <w:r>
+        <w:t xml:space="preserve"> REF </w:t>
+      </w:r>
+      <w:proofErr w:type="spellStart"/>
+      <w:r>
+        <w:t>tourism_with_id</w:t>
+      </w:r>
+      <w:proofErr w:type="spellEnd"/>
+      <w:r>
+        <w:t>(</w:t>
+      </w:r>
+      <w:proofErr w:type="spellStart"/>
+      <w:r>
+        <w:t>place_id</w:t>
+      </w:r>
+      <w:proofErr w:type="spellEnd"/>
+      <w:r>
+        <w:t>)</w:t>
       </w:r>
     </w:p>
     <w:p>
@@ -292,17 +484,479 @@
       <w:pPr>
         <w:spacing w:after="0"/>
       </w:pPr>
-      <w:r>
+      <w:proofErr w:type="gramStart"/>
+      <w:r>
+        <w:rPr>
+          <w:highlight w:val="yellow"/>
+        </w:rPr>
         <w:t>user(</w:t>
       </w:r>
-      <w:r>
-        <w:rPr>
+      <w:proofErr w:type="spellStart"/>
+      <w:proofErr w:type="gramEnd"/>
+      <w:r>
+        <w:rPr>
+          <w:highlight w:val="yellow"/>
           <w:u w:val="single"/>
         </w:rPr>
+        <w:t>user_i</w:t>
+      </w:r>
+      <w:r>
+        <w:rPr>
+          <w:u w:val="single"/>
+        </w:rPr>
+        <w:t>d</w:t>
+      </w:r>
+      <w:proofErr w:type="spellEnd"/>
+      <w:r>
+        <w:t xml:space="preserve">, </w:t>
+      </w:r>
+      <w:proofErr w:type="spellStart"/>
+      <w:r>
+        <w:t>fk_city_id</w:t>
+      </w:r>
+      <w:proofErr w:type="spellEnd"/>
+      <w:r>
+        <w:t>, age)</w:t>
+      </w:r>
+    </w:p>
+    <w:p>
+      <w:pPr>
+        <w:spacing w:after="0"/>
+      </w:pPr>
+      <w:r>
+        <w:tab/>
+        <w:t xml:space="preserve">FK </w:t>
+      </w:r>
+      <w:proofErr w:type="spellStart"/>
+      <w:r>
+        <w:t>fk_city_id</w:t>
+      </w:r>
+      <w:proofErr w:type="spellEnd"/>
+      <w:r>
+        <w:t xml:space="preserve"> REF location(</w:t>
+      </w:r>
+      <w:proofErr w:type="spellStart"/>
+      <w:r>
+        <w:t>city_id</w:t>
+      </w:r>
+      <w:proofErr w:type="spellEnd"/>
+      <w:r>
+        <w:t>)</w:t>
+      </w:r>
+    </w:p>
+    <w:p>
+      <w:pPr>
+        <w:spacing w:after="0"/>
+      </w:pPr>
+      <w:proofErr w:type="gramStart"/>
+      <w:r>
+        <w:rPr>
+          <w:highlight w:val="yellow"/>
+        </w:rPr>
+        <w:t>location(</w:t>
+      </w:r>
+      <w:proofErr w:type="spellStart"/>
+      <w:proofErr w:type="gramEnd"/>
+      <w:r>
+        <w:rPr>
+          <w:u w:val="single"/>
+        </w:rPr>
+        <w:t>city_id</w:t>
+      </w:r>
+      <w:proofErr w:type="spellEnd"/>
+      <w:r>
+        <w:t xml:space="preserve">, </w:t>
+      </w:r>
+      <w:proofErr w:type="spellStart"/>
+      <w:r>
+        <w:t>city_name</w:t>
+      </w:r>
+      <w:proofErr w:type="spellEnd"/>
+      <w:r>
+        <w:t>, province)</w:t>
+      </w:r>
+    </w:p>
+    <w:p>
+      <w:pPr>
+        <w:spacing w:after="0"/>
+      </w:pPr>
+      <w:proofErr w:type="spellStart"/>
+      <w:r>
+        <w:rPr>
+          <w:highlight w:val="yellow"/>
+        </w:rPr>
+        <w:t>tour_</w:t>
+      </w:r>
+      <w:proofErr w:type="gramStart"/>
+      <w:r>
+        <w:rPr>
+          <w:highlight w:val="yellow"/>
+        </w:rPr>
+        <w:t>categ</w:t>
+      </w:r>
+      <w:r>
+        <w:t>ory</w:t>
+      </w:r>
+      <w:proofErr w:type="spellEnd"/>
+      <w:r>
+        <w:t>(</w:t>
+      </w:r>
+      <w:proofErr w:type="spellStart"/>
+      <w:proofErr w:type="gramEnd"/>
+      <w:r>
+        <w:rPr>
+          <w:u w:val="single"/>
+        </w:rPr>
+        <w:t>category_id</w:t>
+      </w:r>
+      <w:proofErr w:type="spellEnd"/>
+      <w:r>
+        <w:t xml:space="preserve">, </w:t>
+      </w:r>
+      <w:proofErr w:type="spellStart"/>
+      <w:r>
+        <w:t>category_name</w:t>
+      </w:r>
+      <w:proofErr w:type="spellEnd"/>
+      <w:r>
+        <w:t>)</w:t>
+      </w:r>
+    </w:p>
+    <w:p>
+      <w:pPr>
+        <w:spacing w:after="0"/>
+      </w:pPr>
+      <w:proofErr w:type="gramStart"/>
+      <w:r>
+        <w:rPr>
+          <w:highlight w:val="yellow"/>
+        </w:rPr>
+        <w:t>tourism(</w:t>
+      </w:r>
+      <w:proofErr w:type="spellStart"/>
+      <w:proofErr w:type="gramEnd"/>
+      <w:r>
+        <w:rPr>
+          <w:highlight w:val="yellow"/>
+          <w:u w:val="single"/>
+        </w:rPr>
+        <w:t>place_id</w:t>
+      </w:r>
+      <w:proofErr w:type="spellEnd"/>
+      <w:r>
+        <w:rPr>
+          <w:highlight w:val="yellow"/>
+        </w:rPr>
+        <w:t>,</w:t>
+      </w:r>
+      <w:r>
+        <w:t xml:space="preserve"> </w:t>
+      </w:r>
+      <w:proofErr w:type="spellStart"/>
+      <w:r>
+        <w:t>place_name</w:t>
+      </w:r>
+      <w:proofErr w:type="spellEnd"/>
+      <w:r>
+        <w:t xml:space="preserve">, description, </w:t>
+      </w:r>
+      <w:proofErr w:type="spellStart"/>
+      <w:r>
+        <w:t>fk_city_id</w:t>
+      </w:r>
+      <w:proofErr w:type="spellEnd"/>
+      <w:r>
+        <w:t xml:space="preserve">, </w:t>
+      </w:r>
+      <w:proofErr w:type="spellStart"/>
+      <w:r>
+        <w:t>fk_category_id</w:t>
+      </w:r>
+      <w:proofErr w:type="spellEnd"/>
+      <w:r>
+        <w:t xml:space="preserve">, </w:t>
+      </w:r>
+      <w:proofErr w:type="spellStart"/>
+      <w:r>
+        <w:t>avg_rating</w:t>
+      </w:r>
+      <w:proofErr w:type="spellEnd"/>
+      <w:r>
+        <w:t xml:space="preserve">, </w:t>
+      </w:r>
+      <w:r>
+        <w:t xml:space="preserve">price, </w:t>
+      </w:r>
+      <w:proofErr w:type="spellStart"/>
+      <w:r>
+        <w:t>time_minute</w:t>
+      </w:r>
+      <w:proofErr w:type="spellEnd"/>
+      <w:r>
+        <w:t xml:space="preserve">, </w:t>
+      </w:r>
+      <w:proofErr w:type="spellStart"/>
+      <w:r>
+        <w:t>latitude,longitude</w:t>
+      </w:r>
+      <w:proofErr w:type="spellEnd"/>
+      <w:r>
+        <w:t>)</w:t>
+      </w:r>
+    </w:p>
+    <w:p>
+      <w:pPr>
+        <w:spacing w:after="0"/>
+      </w:pPr>
+      <w:r>
+        <w:tab/>
+        <w:t xml:space="preserve">FK </w:t>
+      </w:r>
+      <w:proofErr w:type="spellStart"/>
+      <w:r>
+        <w:t>fk_city_id</w:t>
+      </w:r>
+      <w:proofErr w:type="spellEnd"/>
+      <w:r>
+        <w:t xml:space="preserve"> REF location(</w:t>
+      </w:r>
+      <w:proofErr w:type="spellStart"/>
+      <w:r>
+        <w:t>city_id</w:t>
+      </w:r>
+      <w:proofErr w:type="spellEnd"/>
+      <w:r>
+        <w:t>)</w:t>
+      </w:r>
+    </w:p>
+    <w:p>
+      <w:pPr>
+        <w:spacing w:after="0"/>
+      </w:pPr>
+      <w:r>
+        <w:tab/>
+        <w:t xml:space="preserve">FK </w:t>
+      </w:r>
+      <w:proofErr w:type="spellStart"/>
+      <w:r>
+        <w:t>fk_category_id</w:t>
+      </w:r>
+      <w:proofErr w:type="spellEnd"/>
+      <w:r>
+        <w:t xml:space="preserve"> REF </w:t>
+      </w:r>
+      <w:proofErr w:type="spellStart"/>
+      <w:r>
+        <w:t>tour_category</w:t>
+      </w:r>
+      <w:proofErr w:type="spellEnd"/>
+      <w:r>
+        <w:t>(</w:t>
+      </w:r>
+      <w:proofErr w:type="spellStart"/>
+      <w:r>
+        <w:t>category_id</w:t>
+      </w:r>
+      <w:proofErr w:type="spellEnd"/>
+      <w:r>
+        <w:t>)</w:t>
+      </w:r>
+    </w:p>
+    <w:p>
+      <w:pPr>
+        <w:pStyle w:val="Heading2"/>
+      </w:pPr>
+      <w:r>
+        <w:t xml:space="preserve">Mapping </w:t>
+      </w:r>
+      <w:proofErr w:type="gramStart"/>
+      <w:r>
+        <w:t>1:N</w:t>
+      </w:r>
+      <w:proofErr w:type="gramEnd"/>
+      <w:r>
+        <w:t xml:space="preserve"> relation</w:t>
+      </w:r>
+    </w:p>
+    <w:p>
+      <w:pPr>
+        <w:spacing w:after="0"/>
+      </w:pPr>
+      <w:proofErr w:type="spellStart"/>
+      <w:r>
+        <w:rPr>
+          <w:highlight w:val="yellow"/>
+        </w:rPr>
+        <w:t>tour_</w:t>
+      </w:r>
+      <w:proofErr w:type="gramStart"/>
+      <w:r>
+        <w:rPr>
+          <w:highlight w:val="yellow"/>
+        </w:rPr>
+        <w:t>packag</w:t>
+      </w:r>
+      <w:r>
+        <w:t>e</w:t>
+      </w:r>
+      <w:proofErr w:type="spellEnd"/>
+      <w:r>
+        <w:t>(</w:t>
+      </w:r>
+      <w:proofErr w:type="spellStart"/>
+      <w:proofErr w:type="gramEnd"/>
+      <w:r>
+        <w:rPr>
+          <w:u w:val="single"/>
+        </w:rPr>
+        <w:t>package_id</w:t>
+      </w:r>
+      <w:proofErr w:type="spellEnd"/>
+      <w:r>
+        <w:t xml:space="preserve">, </w:t>
+      </w:r>
+      <w:proofErr w:type="spellStart"/>
+      <w:r>
+        <w:t>fk_place_id</w:t>
+      </w:r>
+      <w:proofErr w:type="spellEnd"/>
+      <w:r>
+        <w:t xml:space="preserve">, </w:t>
+      </w:r>
+      <w:proofErr w:type="spellStart"/>
+      <w:r>
+        <w:t>sum_price</w:t>
+      </w:r>
+      <w:proofErr w:type="spellEnd"/>
+      <w:r>
+        <w:t xml:space="preserve">, </w:t>
+      </w:r>
+      <w:proofErr w:type="spellStart"/>
+      <w:r>
+        <w:t>avg_rating</w:t>
+      </w:r>
+      <w:proofErr w:type="spellEnd"/>
+      <w:r>
+        <w:t>)</w:t>
+      </w:r>
+    </w:p>
+    <w:p>
+      <w:pPr>
+        <w:spacing w:after="0"/>
+      </w:pPr>
+      <w:r>
+        <w:tab/>
+        <w:t xml:space="preserve">FK </w:t>
+      </w:r>
+      <w:proofErr w:type="spellStart"/>
+      <w:r>
+        <w:t>fk_place_id</w:t>
+      </w:r>
+      <w:proofErr w:type="spellEnd"/>
+      <w:r>
+        <w:t xml:space="preserve"> REF tourism(</w:t>
+      </w:r>
+      <w:proofErr w:type="spellStart"/>
+      <w:r>
+        <w:t>place_id</w:t>
+      </w:r>
+      <w:proofErr w:type="spellEnd"/>
+      <w:r>
+        <w:t>)</w:t>
+      </w:r>
+    </w:p>
+    <w:p>
+      <w:pPr>
+        <w:pStyle w:val="Heading2"/>
+      </w:pPr>
+      <w:proofErr w:type="gramStart"/>
+      <w:r>
+        <w:t>M:N</w:t>
+      </w:r>
+      <w:proofErr w:type="gramEnd"/>
+      <w:r>
+        <w:t xml:space="preserve"> becomes a separate relation</w:t>
+      </w:r>
+    </w:p>
+    <w:p>
+      <w:pPr>
+        <w:spacing w:after="0"/>
+      </w:pPr>
+      <w:proofErr w:type="spellStart"/>
+      <w:r>
+        <w:rPr>
+          <w:highlight w:val="yellow"/>
+        </w:rPr>
+        <w:t>tour_</w:t>
+      </w:r>
+      <w:proofErr w:type="gramStart"/>
+      <w:r>
+        <w:rPr>
+          <w:highlight w:val="yellow"/>
+        </w:rPr>
+        <w:t>rating</w:t>
+      </w:r>
+      <w:proofErr w:type="spellEnd"/>
+      <w:r>
+        <w:rPr>
+          <w:highlight w:val="yellow"/>
+        </w:rPr>
+        <w:t>(</w:t>
+      </w:r>
+      <w:proofErr w:type="spellStart"/>
+      <w:proofErr w:type="gramEnd"/>
+      <w:r>
+        <w:rPr>
+          <w:highlight w:val="yellow"/>
+          <w:u w:val="single"/>
+        </w:rPr>
+        <w:t>user</w:t>
+      </w:r>
+      <w:r>
+        <w:rPr>
+          <w:u w:val="single"/>
+        </w:rPr>
+        <w:t>_id</w:t>
+      </w:r>
+      <w:proofErr w:type="spellEnd"/>
+      <w:r>
+        <w:t xml:space="preserve">, </w:t>
+      </w:r>
+      <w:proofErr w:type="spellStart"/>
+      <w:r>
+        <w:rPr>
+          <w:u w:val="single"/>
+        </w:rPr>
+        <w:t>place_id</w:t>
+      </w:r>
+      <w:proofErr w:type="spellEnd"/>
+      <w:r>
+        <w:t>, rating)</w:t>
+      </w:r>
+    </w:p>
+    <w:p>
+      <w:pPr>
+        <w:spacing w:after="0"/>
+      </w:pPr>
+      <w:r>
+        <w:tab/>
+        <w:t xml:space="preserve">FK </w:t>
+      </w:r>
+      <w:proofErr w:type="spellStart"/>
+      <w:r>
         <w:t>user_id</w:t>
       </w:r>
-      <w:r>
-        <w:t>, fk_city_id, age)</w:t>
+      <w:proofErr w:type="spellEnd"/>
+      <w:r>
+        <w:t xml:space="preserve"> REF user(</w:t>
+      </w:r>
+      <w:proofErr w:type="spellStart"/>
+      <w:r>
+        <w:t>user_id</w:t>
+      </w:r>
+      <w:proofErr w:type="spellEnd"/>
+      <w:r>
+        <w:t>)</w:t>
       </w:r>
     </w:p>
     <w:p>
@@ -311,168 +965,23 @@
       </w:pPr>
       <w:r>
         <w:tab/>
-        <w:t>FK fk_city_id REF location(city_id)</w:t>
-      </w:r>
-    </w:p>
-    <w:p>
-      <w:pPr>
-        <w:spacing w:after="0"/>
-      </w:pPr>
-      <w:r>
-        <w:t>location(</w:t>
-      </w:r>
-      <w:r>
-        <w:rPr>
-          <w:u w:val="single"/>
-        </w:rPr>
-        <w:t>city_id</w:t>
-      </w:r>
-      <w:r>
-        <w:t>, city_name, province)</w:t>
-      </w:r>
-    </w:p>
-    <w:p>
-      <w:pPr>
-        <w:spacing w:after="0"/>
-      </w:pPr>
-      <w:r>
-        <w:t>tour_category(</w:t>
-      </w:r>
-      <w:r>
-        <w:rPr>
-          <w:u w:val="single"/>
-        </w:rPr>
-        <w:t>category_id</w:t>
-      </w:r>
-      <w:r>
-        <w:t>, category_name)</w:t>
-      </w:r>
-    </w:p>
-    <w:p>
-      <w:pPr>
-        <w:spacing w:after="0"/>
-      </w:pPr>
-      <w:r>
-        <w:t>tourism(</w:t>
-      </w:r>
-      <w:r>
-        <w:rPr>
-          <w:u w:val="single"/>
-        </w:rPr>
+        <w:t xml:space="preserve">FK </w:t>
+      </w:r>
+      <w:proofErr w:type="spellStart"/>
+      <w:r>
         <w:t>place_id</w:t>
       </w:r>
-      <w:r>
-        <w:t xml:space="preserve">, place_name, description, fk_city_id, fk_category_id, avg_rating, </w:t>
-      </w:r>
-      <w:r>
-        <w:t xml:space="preserve">price, </w:t>
-      </w:r>
-      <w:r>
-        <w:t>time_minute, latitude,longitude)</w:t>
-      </w:r>
-    </w:p>
-    <w:p>
-      <w:pPr>
-        <w:spacing w:after="0"/>
-      </w:pPr>
-      <w:r>
-        <w:tab/>
-        <w:t>FK fk_city_id REF location(city_id)</w:t>
-      </w:r>
-    </w:p>
-    <w:p>
-      <w:pPr>
-        <w:spacing w:after="0"/>
-      </w:pPr>
-      <w:r>
-        <w:tab/>
-        <w:t>FK fk_category_id REF tour_category(category_id)</w:t>
-      </w:r>
-    </w:p>
-    <w:p>
-      <w:pPr>
-        <w:pStyle w:val="Heading2"/>
-      </w:pPr>
-      <w:r>
-        <w:t>Mapping 1:N relation</w:t>
-      </w:r>
-    </w:p>
-    <w:p>
-      <w:pPr>
-        <w:spacing w:after="0"/>
-      </w:pPr>
-      <w:r>
-        <w:t>tour_package(</w:t>
-      </w:r>
-      <w:r>
-        <w:rPr>
-          <w:u w:val="single"/>
-        </w:rPr>
-        <w:t>package_id</w:t>
-      </w:r>
-      <w:r>
-        <w:t>, fk_place_id, sum_price, avg_rating)</w:t>
-      </w:r>
-    </w:p>
-    <w:p>
-      <w:pPr>
-        <w:spacing w:after="0"/>
-      </w:pPr>
-      <w:r>
-        <w:tab/>
-        <w:t>FK fk_place_id REF tourism(place_id)</w:t>
-      </w:r>
-    </w:p>
-    <w:p>
-      <w:pPr>
-        <w:pStyle w:val="Heading2"/>
-      </w:pPr>
-      <w:r>
-        <w:t>M:N becomes a separate relation</w:t>
-      </w:r>
-    </w:p>
-    <w:p>
-      <w:pPr>
-        <w:spacing w:after="0"/>
-      </w:pPr>
-      <w:r>
-        <w:t>tour_rating(</w:t>
-      </w:r>
-      <w:r>
-        <w:rPr>
-          <w:u w:val="single"/>
-        </w:rPr>
-        <w:t>user_id</w:t>
-      </w:r>
-      <w:r>
-        <w:t xml:space="preserve">, </w:t>
-      </w:r>
-      <w:r>
-        <w:rPr>
-          <w:u w:val="single"/>
-        </w:rPr>
+      <w:proofErr w:type="spellEnd"/>
+      <w:r>
+        <w:t xml:space="preserve"> REF tourism(</w:t>
+      </w:r>
+      <w:proofErr w:type="spellStart"/>
+      <w:r>
         <w:t>place_id</w:t>
       </w:r>
-      <w:r>
-        <w:t>, rating)</w:t>
-      </w:r>
-    </w:p>
-    <w:p>
-      <w:pPr>
-        <w:spacing w:after="0"/>
-      </w:pPr>
-      <w:r>
-        <w:tab/>
-        <w:t>FK user_id REF user(user_id)</w:t>
-      </w:r>
-    </w:p>
-    <w:p>
-      <w:pPr>
-        <w:spacing w:after="0"/>
-      </w:pPr>
-      <w:r>
-        <w:tab/>
-        <w:t>FK place_id REF tourism(place_id)</w:t>
+      <w:proofErr w:type="spellEnd"/>
+      <w:r>
+        <w:t>)</w:t>
       </w:r>
     </w:p>
     <w:p>

</xml_diff>